<commit_message>
docs: Ultimo toque, solo queda rezar
</commit_message>
<xml_diff>
--- a/reports/C2/04 - Requirements - Student #4.docx
+++ b/reports/C2/04 - Requirements - Student #4.docx
@@ -1796,7 +1796,19 @@
         <w:rPr>
           <w:lang w:val="es-ES"/>
         </w:rPr>
-        <w:t>3.- Al ser un atributo tipo enumerado en los métodos unbind debemos crear atributos tipo SelectChoices para este y añadirlos al datset.</w:t>
+        <w:t>3.-</w:t>
+      </w:r>
+      <w:r>
+        <w:rPr>
+          <w:lang w:val="es-ES"/>
+        </w:rPr>
+        <w:t xml:space="preserve"> </w:t>
+      </w:r>
+      <w:r>
+        <w:rPr>
+          <w:lang w:val="es-ES"/>
+        </w:rPr>
+        <w:t>Al ser un atributo tipo enumerado en los métodos unbind debemos crear atributos tipo SelectChoices para este y añadirlos al datset.</w:t>
       </w:r>
     </w:p>
     <w:p>
@@ -1810,12 +1822,19 @@
         <w:rPr>
           <w:lang w:val="es-ES"/>
         </w:rPr>
+        <w:lastRenderedPageBreak/>
         <w:t>4.- Añadir nuevas etiquetas para el elemento indicator en los form.jsp y list.jsp (se ha decidido que cuando se use el comando “create” este elemento sea de tipo readonly con un valor por defecto)</w:t>
       </w:r>
       <w:r>
         <w:rPr>
           <w:lang w:val="es-ES"/>
         </w:rPr>
+        <w:t xml:space="preserve"> (se ha controlado el posible hack en el método bind del create)</w:t>
+      </w:r>
+      <w:r>
+        <w:rPr>
+          <w:lang w:val="es-ES"/>
+        </w:rPr>
         <w:t>.</w:t>
       </w:r>
     </w:p>
@@ -1830,7 +1849,6 @@
         <w:rPr>
           <w:lang w:val="es-ES"/>
         </w:rPr>
-        <w:lastRenderedPageBreak/>
         <w:t>5.- Añadir el atributo en el csv correspondiente y darle valores acorde al contexto del log</w:t>
       </w:r>
       <w:r>
@@ -1883,7 +1901,19 @@
         <w:rPr>
           <w:lang w:val="es-ES"/>
         </w:rPr>
-        <w:t>7.- Se han rehecho los tests de las features asociadas a esta entidad tratando de mantener un porcentaje similar o mejor al anterior.</w:t>
+        <w:t>7.- Se han rehecho los tests de las features asociadas a esta entidad tratando de mantener un porcentaje similar</w:t>
+      </w:r>
+      <w:r>
+        <w:rPr>
+          <w:lang w:val="es-ES"/>
+        </w:rPr>
+        <w:t xml:space="preserve"> al anterior</w:t>
+      </w:r>
+      <w:r>
+        <w:rPr>
+          <w:lang w:val="es-ES"/>
+        </w:rPr>
+        <w:t>.</w:t>
       </w:r>
     </w:p>
     <w:p>
@@ -2717,13 +2747,19 @@
         <w:rPr>
           <w:lang w:val="es-ES"/>
         </w:rPr>
-        <w:t>Manuel J. Benito Merchán - Para solucionar e</w:t>
+        <w:t>Manuel J. Benito Merchán - Para solucionar el primer problema se ha añadido una validación con su respectiva etiqueta de mensaje de error en la feature de create y update que no permite esto y se ha modificado la relación con claim en el UML</w:t>
       </w:r>
       <w:r>
         <w:rPr>
           <w:lang w:val="es-ES"/>
         </w:rPr>
-        <w:t>l primer problema se ha añadido una validación con su respectiva etiqueta de mensaje de error en la feature de create y update que no permite esto y se ha modificado la relación con claim en el UML.</w:t>
+        <w:t xml:space="preserve"> (La relación sigue siendo ManyToOne, pero la multiplicidad ahora es de 1..2 -&gt; 1 ya que solo se permiten 2 logs como máximo por claim, para que así haya una mayor claridad y transparencia)</w:t>
+      </w:r>
+      <w:r>
+        <w:rPr>
+          <w:lang w:val="es-ES"/>
+        </w:rPr>
+        <w:t>.</w:t>
       </w:r>
     </w:p>
     <w:p>
@@ -2737,25 +2773,7 @@
         <w:rPr>
           <w:lang w:val="es-ES"/>
         </w:rPr>
-        <w:t xml:space="preserve">Manuel J. Benito Merchán - Para solucionar el </w:t>
-      </w:r>
-      <w:r>
-        <w:rPr>
-          <w:lang w:val="es-ES"/>
-        </w:rPr>
-        <w:t>segundo</w:t>
-      </w:r>
-      <w:r>
-        <w:rPr>
-          <w:lang w:val="es-ES"/>
-        </w:rPr>
-        <w:t xml:space="preserve"> problema se ha añadido una validación con su respectiva etiqueta de mensaje de error en la feature de update que no permite esto</w:t>
-      </w:r>
-      <w:r>
-        <w:rPr>
-          <w:lang w:val="es-ES"/>
-        </w:rPr>
-        <w:t>.</w:t>
+        <w:t>Manuel J. Benito Merchán - Para solucionar el segundo problema se ha añadido una validación con su respectiva etiqueta de mensaje de error en la feature de update que no permite esto.</w:t>
       </w:r>
     </w:p>
     <w:p>
@@ -11265,6 +11283,7 @@
   <w:rsids>
     <w:rsidRoot w:val="004D7778"/>
     <w:rsid w:val="00061CE8"/>
+    <w:rsid w:val="00067AA9"/>
     <w:rsid w:val="00081127"/>
     <w:rsid w:val="000D195B"/>
     <w:rsid w:val="000E506A"/>
@@ -11282,6 +11301,7 @@
     <w:rsid w:val="002150FE"/>
     <w:rsid w:val="002D427D"/>
     <w:rsid w:val="00362E40"/>
+    <w:rsid w:val="003816C8"/>
     <w:rsid w:val="003936CA"/>
     <w:rsid w:val="003F2B3F"/>
     <w:rsid w:val="004C7734"/>

</xml_diff>